<commit_message>
feat: enmarcar capturas del manual con marco de movil, notch en landing y precios Pro/Multi a 49,90/39,90 con IVA incl.
</commit_message>
<xml_diff>
--- a/marketing/Vitryna_manual_Comercios.docx
+++ b/marketing/Vitryna_manual_Comercios.docx
@@ -2814,7 +2814,7 @@
               <w:rPr>
                 <w:color w:val="222222"/>
               </w:rPr>
-              <w:t>19,90 €/mes</w:t>
+              <w:t>49,90 €/mes (IVA incl.)</w:t>
             </w:r>
           </w:p>
         </w:tc>
@@ -2916,7 +2916,7 @@
               <w:rPr>
                 <w:color w:val="222222"/>
               </w:rPr>
-              <w:t>15,98 €/comercio/mes</w:t>
+              <w:t>39,90 €/comercio/mes (IVA incl.)</w:t>
             </w:r>
           </w:p>
         </w:tc>

</xml_diff>

<commit_message>
fix: manual de comercios - IVA en boosts, campos reales de registro, quitar negrita del FAQ, cuenta en Comunidad, titulo en Bricolage Grotesque
</commit_message>
<xml_diff>
--- a/marketing/Vitryna_manual_Comercios.docx
+++ b/marketing/Vitryna_manual_Comercios.docx
@@ -91,6 +91,7 @@
       </w:pPr>
       <w:r>
         <w:rPr>
+          <w:rFonts w:ascii="Bricolage Grotesque 36pt ExtraB" w:hAnsi="Bricolage Grotesque 36pt ExtraB" w:cs="Bricolage Grotesque 36pt ExtraB"/>
           <w:b/>
           <w:bCs/>
           <w:color w:val="222222"/>
@@ -477,6 +478,24 @@
           <w:sz w:val="22"/>
           <w:szCs w:val="22"/>
         </w:rPr>
+        <w:t>Email y contraseña — con los que iniciarás sesión en tu cuenta de comercio.</w:t>
+      </w:r>
+    </w:p>
+    <w:p>
+      <w:pPr>
+        <w:pStyle w:val="Prrafodelista"/>
+        <w:numPr>
+          <w:ilvl w:val="0"/>
+          <w:numId w:val="2"/>
+        </w:numPr>
+        <w:spacing w:after="90" w:line="280" w:lineRule="auto"/>
+      </w:pPr>
+      <w:r>
+        <w:rPr>
+          <w:color w:val="222222"/>
+          <w:sz w:val="22"/>
+          <w:szCs w:val="22"/>
+        </w:rPr>
         <w:t>Nombre del comercio y categoría (Hostelería, Alimentación, Moda y complementos, Salud y belleza, Servicios, Hogar y decoración, Deporte, Cultura y ocio, u Otros).</w:t>
       </w:r>
     </w:p>
@@ -513,7 +532,61 @@
           <w:sz w:val="22"/>
           <w:szCs w:val="22"/>
         </w:rPr>
-        <w:t>Ubicación del comercio, para situarlo correctamente en el mapa del barrio.</w:t>
+        <w:t>CIF/NIF/NIE — dato usado también para la facturación y para el cálculo del plan Multi-Barrio (ver sección 11).</w:t>
+      </w:r>
+    </w:p>
+    <w:p>
+      <w:pPr>
+        <w:pStyle w:val="Prrafodelista"/>
+        <w:numPr>
+          <w:ilvl w:val="0"/>
+          <w:numId w:val="2"/>
+        </w:numPr>
+        <w:spacing w:after="90" w:line="280" w:lineRule="auto"/>
+      </w:pPr>
+      <w:r>
+        <w:rPr>
+          <w:color w:val="222222"/>
+          <w:sz w:val="22"/>
+          <w:szCs w:val="22"/>
+        </w:rPr>
+        <w:t>Descripción del comercio — un breve texto visible en tu perfil para que los vecinos sepan qué ofreces.</w:t>
+      </w:r>
+    </w:p>
+    <w:p>
+      <w:pPr>
+        <w:pStyle w:val="Prrafodelista"/>
+        <w:numPr>
+          <w:ilvl w:val="0"/>
+          <w:numId w:val="2"/>
+        </w:numPr>
+        <w:spacing w:after="90" w:line="280" w:lineRule="auto"/>
+      </w:pPr>
+      <w:r>
+        <w:rPr>
+          <w:color w:val="222222"/>
+          <w:sz w:val="22"/>
+          <w:szCs w:val="22"/>
+        </w:rPr>
+        <w:t>Ubicación del comercio — se calcula automáticamente por geolocalización a partir de tu posición actual o de la dirección que introduzcas, sin que tengas que situarla tú mismo en un mapa.</w:t>
+      </w:r>
+    </w:p>
+    <w:p>
+      <w:pPr>
+        <w:pStyle w:val="Prrafodelista"/>
+        <w:numPr>
+          <w:ilvl w:val="0"/>
+          <w:numId w:val="2"/>
+        </w:numPr>
+        <w:spacing w:after="90" w:line="280" w:lineRule="auto"/>
+      </w:pPr>
+      <w:r>
+        <w:rPr>
+          <w:color w:val="222222"/>
+          <w:sz w:val="22"/>
+          <w:szCs w:val="22"/>
+        </w:rPr>
+        <w:t>Datos de contacto y horario — teléfono, página web y horario de apertura, visibles en tu perfil.</w:t>
       </w:r>
     </w:p>
     <w:p>
@@ -1723,7 +1796,7 @@
           <w:sz w:val="22"/>
           <w:szCs w:val="22"/>
         </w:rPr>
-        <w:t>En este mismo bloque también encontrarás el acceso a los Términos de Servicio, la Política de Privacidad, y el enlace para enviar sugerencias o incidencias.</w:t>
+        <w:t>En este mismo bloque también encontrarás el acceso a los Términos de Servicio, la Política de Privacidad, el enlace para enviar sugerencias o incidencias, y las opciones para cerrar sesión o eliminar tu cuenta.</w:t>
       </w:r>
     </w:p>
     <w:p>
@@ -2503,7 +2576,7 @@
           <w:iCs/>
           <w:color w:val="595959"/>
         </w:rPr>
-        <w:t>Si te quedas sin boosts disponibles, el panel principal te muestra directamente el acceso para comprar un nuevo pack.</w:t>
+        <w:t>Si te quedas sin boosts disponibles, el panel principal te muestra directamente el acceso para comprar un nuevo pack. Todos los precios de boosts incluyen IVA.</w:t>
       </w:r>
     </w:p>
     <w:p>
@@ -3379,6 +3452,7 @@
         <w:pStyle w:val="Ttulo2"/>
         <w:spacing w:before="260" w:after="120"/>
         <w:rPr>
+          <w:b w:val="0"/>
           <w:color w:val="222222"/>
           <w:sz w:val="22"/>
           <w:szCs w:val="22"/>
@@ -3402,6 +3476,7 @@
       </w:r>
       <w:r>
         <w:rPr>
+          <w:b w:val="0"/>
           <w:color w:val="222222"/>
           <w:sz w:val="22"/>
           <w:szCs w:val="22"/>
@@ -3410,6 +3485,7 @@
       </w:r>
       <w:r>
         <w:rPr>
+          <w:b w:val="0"/>
           <w:color w:val="222222"/>
           <w:sz w:val="22"/>
           <w:szCs w:val="22"/>
@@ -3418,6 +3494,7 @@
       </w:r>
       <w:r>
         <w:rPr>
+          <w:b w:val="0"/>
           <w:color w:val="222222"/>
           <w:sz w:val="22"/>
           <w:szCs w:val="22"/>
@@ -3426,6 +3503,7 @@
       </w:r>
       <w:r>
         <w:rPr>
+          <w:b w:val="0"/>
           <w:color w:val="222222"/>
           <w:sz w:val="22"/>
           <w:szCs w:val="22"/>
@@ -3434,6 +3512,7 @@
       </w:r>
       <w:r>
         <w:rPr>
+          <w:b w:val="0"/>
           <w:color w:val="222222"/>
           <w:sz w:val="22"/>
           <w:szCs w:val="22"/>
@@ -3442,6 +3521,7 @@
       </w:r>
       <w:r>
         <w:rPr>
+          <w:b w:val="0"/>
           <w:color w:val="222222"/>
           <w:sz w:val="22"/>
           <w:szCs w:val="22"/>
@@ -3454,6 +3534,7 @@
         <w:pStyle w:val="Ttulo2"/>
         <w:spacing w:before="260" w:after="120"/>
         <w:rPr>
+          <w:b w:val="0"/>
           <w:color w:val="222222"/>
           <w:sz w:val="22"/>
           <w:szCs w:val="22"/>
@@ -3477,6 +3558,7 @@
       </w:r>
       <w:r>
         <w:rPr>
+          <w:b w:val="0"/>
           <w:color w:val="222222"/>
           <w:sz w:val="22"/>
           <w:szCs w:val="22"/>

</xml_diff>

<commit_message>
fix: titulo del manual con la fuente de marca aplicada a mano en Word (estilo Titulo); guardar copia del PDF en marketing
</commit_message>
<xml_diff>
--- a/marketing/Vitryna_manual_Comercios.docx
+++ b/marketing/Vitryna_manual_Comercios.docx
@@ -86,20 +86,37 @@
     </w:p>
     <w:p>
       <w:pPr>
-        <w:spacing w:after="500"/>
+        <w:pStyle w:val="Ttulo"/>
         <w:jc w:val="center"/>
-      </w:pPr>
-      <w:r>
-        <w:rPr>
-          <w:rFonts w:ascii="Bricolage Grotesque 36pt ExtraB" w:hAnsi="Bricolage Grotesque 36pt ExtraB" w:cs="Bricolage Grotesque 36pt ExtraB"/>
-          <w:b/>
-          <w:bCs/>
-          <w:color w:val="222222"/>
+        <w:rPr>
           <w:sz w:val="32"/>
           <w:szCs w:val="32"/>
         </w:rPr>
-        <w:t>Manual de uso para comercios</w:t>
-      </w:r>
+      </w:pPr>
+      <w:r>
+        <w:rPr>
+          <w:sz w:val="32"/>
+          <w:szCs w:val="32"/>
+        </w:rPr>
+        <w:t>M</w:t>
+      </w:r>
+      <w:r>
+        <w:rPr>
+          <w:sz w:val="32"/>
+          <w:szCs w:val="32"/>
+        </w:rPr>
+        <w:t>anual de uso para comercios</w:t>
+      </w:r>
+    </w:p>
+    <w:p>
+      <w:pPr>
+        <w:pStyle w:val="Ttulo"/>
+        <w:jc w:val="center"/>
+        <w:rPr>
+          <w:sz w:val="32"/>
+          <w:szCs w:val="32"/>
+        </w:rPr>
+      </w:pPr>
     </w:p>
     <w:p>
       <w:pPr>
@@ -568,6 +585,7 @@
           <w:sz w:val="22"/>
           <w:szCs w:val="22"/>
         </w:rPr>
+        <w:lastRenderedPageBreak/>
         <w:t>Ubicación del comercio — se calcula automáticamente por geolocalización a partir de tu posición actual o de la dirección que introduzcas, sin que tengas que situarla tú mismo en un mapa.</w:t>
       </w:r>
     </w:p>
@@ -639,7 +657,6 @@
           <w:sz w:val="30"/>
           <w:szCs w:val="30"/>
         </w:rPr>
-        <w:lastRenderedPageBreak/>
         <w:t>3. Tu panel de control</w:t>
       </w:r>
     </w:p>
@@ -756,7 +773,25 @@
           <w:sz w:val="22"/>
           <w:szCs w:val="22"/>
         </w:rPr>
-        <w:t>Estado de tus boosts disponibles, con acceso directo a comprar más si se agotan.</w:t>
+        <w:t xml:space="preserve">Estado de tus </w:t>
+      </w:r>
+      <w:proofErr w:type="spellStart"/>
+      <w:r>
+        <w:rPr>
+          <w:color w:val="222222"/>
+          <w:sz w:val="22"/>
+          <w:szCs w:val="22"/>
+        </w:rPr>
+        <w:t>boosts</w:t>
+      </w:r>
+      <w:proofErr w:type="spellEnd"/>
+      <w:r>
+        <w:rPr>
+          <w:color w:val="222222"/>
+          <w:sz w:val="22"/>
+          <w:szCs w:val="22"/>
+        </w:rPr>
+        <w:t xml:space="preserve"> disponibles, con acceso directo a comprar más si se agotan.</w:t>
       </w:r>
     </w:p>
     <w:p>
@@ -827,6 +862,7 @@
           <w:sz w:val="30"/>
           <w:szCs w:val="30"/>
         </w:rPr>
+        <w:lastRenderedPageBreak/>
         <w:t>4. Cómo publicar</w:t>
       </w:r>
     </w:p>
@@ -920,7 +956,6 @@
           <w:sz w:val="22"/>
           <w:szCs w:val="22"/>
         </w:rPr>
-        <w:lastRenderedPageBreak/>
         <w:t>Descripción — texto opcional para ampliar la información.</w:t>
       </w:r>
     </w:p>
@@ -939,7 +974,25 @@
           <w:sz w:val="22"/>
           <w:szCs w:val="22"/>
         </w:rPr>
-        <w:t>Publicar — la publicación queda visible en el feed del barrio de forma inmediata.</w:t>
+        <w:t xml:space="preserve">Publicar — la publicación queda visible en el </w:t>
+      </w:r>
+      <w:proofErr w:type="spellStart"/>
+      <w:r>
+        <w:rPr>
+          <w:color w:val="222222"/>
+          <w:sz w:val="22"/>
+          <w:szCs w:val="22"/>
+        </w:rPr>
+        <w:t>feed</w:t>
+      </w:r>
+      <w:proofErr w:type="spellEnd"/>
+      <w:r>
+        <w:rPr>
+          <w:color w:val="222222"/>
+          <w:sz w:val="22"/>
+          <w:szCs w:val="22"/>
+        </w:rPr>
+        <w:t xml:space="preserve"> del barrio de forma inmediata.</w:t>
       </w:r>
     </w:p>
     <w:p>
@@ -991,7 +1044,25 @@
           <w:iCs/>
           <w:color w:val="595959"/>
         </w:rPr>
-        <w:t xml:space="preserve"> días) antes de pasar a caducadas y dejar de mostrarse en el feed de los vecinos — aunque siguen existiendo y puedes duplicarlas para reactivarlas.</w:t>
+        <w:t xml:space="preserve"> días) antes de pasar a caducadas y dejar de mostrarse en el </w:t>
+      </w:r>
+      <w:proofErr w:type="spellStart"/>
+      <w:r>
+        <w:rPr>
+          <w:i/>
+          <w:iCs/>
+          <w:color w:val="595959"/>
+        </w:rPr>
+        <w:t>feed</w:t>
+      </w:r>
+      <w:proofErr w:type="spellEnd"/>
+      <w:r>
+        <w:rPr>
+          <w:i/>
+          <w:iCs/>
+          <w:color w:val="595959"/>
+        </w:rPr>
+        <w:t xml:space="preserve"> de los vecinos — aunque siguen existiendo y puedes duplicarlas para reactivarlas.</w:t>
       </w:r>
     </w:p>
     <w:p>
@@ -1070,7 +1141,25 @@
           <w:sz w:val="22"/>
           <w:szCs w:val="22"/>
         </w:rPr>
-        <w:t>En la pestaña 'Public.' encontrarás el listado completo de tus publicaciones. Cada una muestra su título, una miniatura de la foto y (en planes Pro/Multi) sus estadísticas de vistas y clics.</w:t>
+        <w:t>En la pestaña '</w:t>
+      </w:r>
+      <w:proofErr w:type="spellStart"/>
+      <w:r>
+        <w:rPr>
+          <w:color w:val="222222"/>
+          <w:sz w:val="22"/>
+          <w:szCs w:val="22"/>
+        </w:rPr>
+        <w:t>Public</w:t>
+      </w:r>
+      <w:proofErr w:type="spellEnd"/>
+      <w:r>
+        <w:rPr>
+          <w:color w:val="222222"/>
+          <w:sz w:val="22"/>
+          <w:szCs w:val="22"/>
+        </w:rPr>
+        <w:t>.' encontrarás el listado completo de tus publicaciones. Cada una muestra su título, una miniatura de la foto y (en planes Pro/Multi) sus estadísticas de vistas y clics.</w:t>
       </w:r>
     </w:p>
     <w:p>
@@ -1103,6 +1192,7 @@
           <w:sz w:val="22"/>
           <w:szCs w:val="22"/>
         </w:rPr>
+        <w:lastRenderedPageBreak/>
         <w:t xml:space="preserve">Duplicar — </w:t>
       </w:r>
       <w:r>
@@ -1123,6 +1213,7 @@
         </w:numPr>
         <w:spacing w:after="90" w:line="280" w:lineRule="auto"/>
       </w:pPr>
+      <w:proofErr w:type="spellStart"/>
       <w:r>
         <w:rPr>
           <w:b/>
@@ -1131,15 +1222,44 @@
           <w:sz w:val="22"/>
           <w:szCs w:val="22"/>
         </w:rPr>
-        <w:t xml:space="preserve">Boost — </w:t>
-      </w:r>
-      <w:r>
-        <w:rPr>
-          <w:color w:val="222222"/>
-          <w:sz w:val="22"/>
-          <w:szCs w:val="22"/>
-        </w:rPr>
-        <w:t>destacar esa publicación durante unas horas para darle mayor visibilidad en el feed del barrio.</w:t>
+        <w:t>Boost</w:t>
+      </w:r>
+      <w:proofErr w:type="spellEnd"/>
+      <w:r>
+        <w:rPr>
+          <w:b/>
+          <w:bCs/>
+          <w:color w:val="222222"/>
+          <w:sz w:val="22"/>
+          <w:szCs w:val="22"/>
+        </w:rPr>
+        <w:t xml:space="preserve"> — </w:t>
+      </w:r>
+      <w:r>
+        <w:rPr>
+          <w:color w:val="222222"/>
+          <w:sz w:val="22"/>
+          <w:szCs w:val="22"/>
+        </w:rPr>
+        <w:t xml:space="preserve">destacar esa publicación durante unas horas para darle mayor visibilidad en el </w:t>
+      </w:r>
+      <w:proofErr w:type="spellStart"/>
+      <w:r>
+        <w:rPr>
+          <w:color w:val="222222"/>
+          <w:sz w:val="22"/>
+          <w:szCs w:val="22"/>
+        </w:rPr>
+        <w:t>feed</w:t>
+      </w:r>
+      <w:proofErr w:type="spellEnd"/>
+      <w:r>
+        <w:rPr>
+          <w:color w:val="222222"/>
+          <w:sz w:val="22"/>
+          <w:szCs w:val="22"/>
+        </w:rPr>
+        <w:t xml:space="preserve"> del barrio.</w:t>
       </w:r>
     </w:p>
     <w:p>
@@ -1185,7 +1305,25 @@
           <w:iCs/>
           <w:color w:val="595959"/>
         </w:rPr>
-        <w:t>Una publicación caducada no aparece en el feed de los vecinos, pero sigue contando en tu historial de estadísticas.</w:t>
+        <w:t xml:space="preserve">Una publicación caducada no aparece en el </w:t>
+      </w:r>
+      <w:proofErr w:type="spellStart"/>
+      <w:r>
+        <w:rPr>
+          <w:i/>
+          <w:iCs/>
+          <w:color w:val="595959"/>
+        </w:rPr>
+        <w:t>feed</w:t>
+      </w:r>
+      <w:proofErr w:type="spellEnd"/>
+      <w:r>
+        <w:rPr>
+          <w:i/>
+          <w:iCs/>
+          <w:color w:val="595959"/>
+        </w:rPr>
+        <w:t xml:space="preserve"> de los vecinos, pero sigue contando en tu historial de estadísticas.</w:t>
       </w:r>
     </w:p>
     <w:p>
@@ -1202,7 +1340,6 @@
           <w:sz w:val="30"/>
           <w:szCs w:val="30"/>
         </w:rPr>
-        <w:lastRenderedPageBreak/>
         <w:t>6. Estadísticas de cada publicación</w:t>
       </w:r>
     </w:p>
@@ -1293,7 +1430,25 @@
           <w:sz w:val="22"/>
           <w:szCs w:val="22"/>
         </w:rPr>
-        <w:t>cuántas personas han visto la publicación en el feed, sin necesidad de haber interactuado más.</w:t>
+        <w:t xml:space="preserve">cuántas personas han visto la publicación en el </w:t>
+      </w:r>
+      <w:proofErr w:type="spellStart"/>
+      <w:r>
+        <w:rPr>
+          <w:color w:val="222222"/>
+          <w:sz w:val="22"/>
+          <w:szCs w:val="22"/>
+        </w:rPr>
+        <w:t>feed</w:t>
+      </w:r>
+      <w:proofErr w:type="spellEnd"/>
+      <w:r>
+        <w:rPr>
+          <w:color w:val="222222"/>
+          <w:sz w:val="22"/>
+          <w:szCs w:val="22"/>
+        </w:rPr>
+        <w:t>, sin necesidad de haber interactuado más.</w:t>
       </w:r>
     </w:p>
     <w:p>
@@ -1341,7 +1496,51 @@
           <w:sz w:val="22"/>
           <w:szCs w:val="22"/>
         </w:rPr>
-        <w:t xml:space="preserve">CTR (Click-Through Rate) — </w:t>
+        <w:t>CTR (</w:t>
+      </w:r>
+      <w:proofErr w:type="spellStart"/>
+      <w:r>
+        <w:rPr>
+          <w:b/>
+          <w:bCs/>
+          <w:color w:val="222222"/>
+          <w:sz w:val="22"/>
+          <w:szCs w:val="22"/>
+        </w:rPr>
+        <w:t>Click-Through</w:t>
+      </w:r>
+      <w:proofErr w:type="spellEnd"/>
+      <w:r>
+        <w:rPr>
+          <w:b/>
+          <w:bCs/>
+          <w:color w:val="222222"/>
+          <w:sz w:val="22"/>
+          <w:szCs w:val="22"/>
+        </w:rPr>
+        <w:t xml:space="preserve"> </w:t>
+      </w:r>
+      <w:proofErr w:type="spellStart"/>
+      <w:r>
+        <w:rPr>
+          <w:b/>
+          <w:bCs/>
+          <w:color w:val="222222"/>
+          <w:sz w:val="22"/>
+          <w:szCs w:val="22"/>
+        </w:rPr>
+        <w:t>Rate</w:t>
+      </w:r>
+      <w:proofErr w:type="spellEnd"/>
+      <w:r>
+        <w:rPr>
+          <w:b/>
+          <w:bCs/>
+          <w:color w:val="222222"/>
+          <w:sz w:val="22"/>
+          <w:szCs w:val="22"/>
+        </w:rPr>
+        <w:t xml:space="preserve">) — </w:t>
       </w:r>
       <w:r>
         <w:rPr>
@@ -1468,7 +1667,25 @@
           <w:sz w:val="22"/>
           <w:szCs w:val="22"/>
         </w:rPr>
-        <w:t>En la pestaña 'Comerc.' tienes tres apartados:</w:t>
+        <w:t>En la pestaña '</w:t>
+      </w:r>
+      <w:proofErr w:type="spellStart"/>
+      <w:r>
+        <w:rPr>
+          <w:color w:val="222222"/>
+          <w:sz w:val="22"/>
+          <w:szCs w:val="22"/>
+        </w:rPr>
+        <w:t>Comerc</w:t>
+      </w:r>
+      <w:proofErr w:type="spellEnd"/>
+      <w:r>
+        <w:rPr>
+          <w:color w:val="222222"/>
+          <w:sz w:val="22"/>
+          <w:szCs w:val="22"/>
+        </w:rPr>
+        <w:t>.' tienes tres apartados:</w:t>
       </w:r>
     </w:p>
     <w:p>
@@ -1727,7 +1944,25 @@
           <w:sz w:val="22"/>
           <w:szCs w:val="22"/>
         </w:rPr>
-        <w:t>Al final de la pestaña 'Comerc.' encontrarás el bloque Comunidad, con dos indicadores:</w:t>
+        <w:t>Al final de la pestaña '</w:t>
+      </w:r>
+      <w:proofErr w:type="spellStart"/>
+      <w:r>
+        <w:rPr>
+          <w:color w:val="222222"/>
+          <w:sz w:val="22"/>
+          <w:szCs w:val="22"/>
+        </w:rPr>
+        <w:t>Comerc</w:t>
+      </w:r>
+      <w:proofErr w:type="spellEnd"/>
+      <w:r>
+        <w:rPr>
+          <w:color w:val="222222"/>
+          <w:sz w:val="22"/>
+          <w:szCs w:val="22"/>
+        </w:rPr>
+        <w:t>.' encontrarás el bloque Comunidad, con dos indicadores:</w:t>
       </w:r>
     </w:p>
     <w:p>
@@ -1923,13 +2158,23 @@
           <w:szCs w:val="22"/>
         </w:rPr>
       </w:pPr>
-      <w:r>
-        <w:rPr>
-          <w:color w:val="222222"/>
-          <w:sz w:val="22"/>
-          <w:szCs w:val="22"/>
-        </w:rPr>
-        <w:t>Feed cronológico de las publicaciones activas de los comercios cercanos, con un slider de radio (en metros) que ajusta la distancia de búsqueda. Es la mejor forma de comprobar cómo se ve tu propia publicación en el contexto del resto del barrio.</w:t>
+      <w:proofErr w:type="spellStart"/>
+      <w:r>
+        <w:rPr>
+          <w:color w:val="222222"/>
+          <w:sz w:val="22"/>
+          <w:szCs w:val="22"/>
+        </w:rPr>
+        <w:t>Feed</w:t>
+      </w:r>
+      <w:proofErr w:type="spellEnd"/>
+      <w:r>
+        <w:rPr>
+          <w:color w:val="222222"/>
+          <w:sz w:val="22"/>
+          <w:szCs w:val="22"/>
+        </w:rPr>
+        <w:t xml:space="preserve"> cronológico de las publicaciones activas de los comercios cercanos, con un slider de radio (en metros) que ajusta la distancia de búsqueda. Es la mejor forma de comprobar cómo se ve tu propia publicación en el contexto del resto del barrio.</w:t>
       </w:r>
     </w:p>
     <w:p>
@@ -2221,7 +2466,25 @@
           <w:sz w:val="30"/>
           <w:szCs w:val="30"/>
         </w:rPr>
-        <w:t>10. Boosts: destacar una publicación</w:t>
+        <w:t xml:space="preserve">10. </w:t>
+      </w:r>
+      <w:proofErr w:type="spellStart"/>
+      <w:r>
+        <w:rPr>
+          <w:color w:val="0E3E99"/>
+          <w:sz w:val="30"/>
+          <w:szCs w:val="30"/>
+        </w:rPr>
+        <w:t>Boosts</w:t>
+      </w:r>
+      <w:proofErr w:type="spellEnd"/>
+      <w:r>
+        <w:rPr>
+          <w:color w:val="0E3E99"/>
+          <w:sz w:val="30"/>
+          <w:szCs w:val="30"/>
+        </w:rPr>
+        <w:t>: destacar una publicación</w:t>
       </w:r>
     </w:p>
     <w:p>
@@ -2234,7 +2497,61 @@
           <w:sz w:val="22"/>
           <w:szCs w:val="22"/>
         </w:rPr>
-        <w:t>Un boost destaca temporalmente una publicación para darle mayor visibilidad en el feed del barrio. Se compran en packs y se consumen desde un monedero propio de tu comercio — cada publicación se puede destacar activando uno de los boosts disponibles.</w:t>
+        <w:t xml:space="preserve">Un </w:t>
+      </w:r>
+      <w:proofErr w:type="spellStart"/>
+      <w:r>
+        <w:rPr>
+          <w:color w:val="222222"/>
+          <w:sz w:val="22"/>
+          <w:szCs w:val="22"/>
+        </w:rPr>
+        <w:t>boost</w:t>
+      </w:r>
+      <w:proofErr w:type="spellEnd"/>
+      <w:r>
+        <w:rPr>
+          <w:color w:val="222222"/>
+          <w:sz w:val="22"/>
+          <w:szCs w:val="22"/>
+        </w:rPr>
+        <w:t xml:space="preserve"> destaca temporalmente una publicación para darle mayor visibilidad en el </w:t>
+      </w:r>
+      <w:proofErr w:type="spellStart"/>
+      <w:r>
+        <w:rPr>
+          <w:color w:val="222222"/>
+          <w:sz w:val="22"/>
+          <w:szCs w:val="22"/>
+        </w:rPr>
+        <w:t>feed</w:t>
+      </w:r>
+      <w:proofErr w:type="spellEnd"/>
+      <w:r>
+        <w:rPr>
+          <w:color w:val="222222"/>
+          <w:sz w:val="22"/>
+          <w:szCs w:val="22"/>
+        </w:rPr>
+        <w:t xml:space="preserve"> del barrio. Se compran en packs y se consumen desde un monedero propio de tu comercio — cada publicación se puede destacar activando uno de los </w:t>
+      </w:r>
+      <w:proofErr w:type="spellStart"/>
+      <w:r>
+        <w:rPr>
+          <w:color w:val="222222"/>
+          <w:sz w:val="22"/>
+          <w:szCs w:val="22"/>
+        </w:rPr>
+        <w:t>boosts</w:t>
+      </w:r>
+      <w:proofErr w:type="spellEnd"/>
+      <w:r>
+        <w:rPr>
+          <w:color w:val="222222"/>
+          <w:sz w:val="22"/>
+          <w:szCs w:val="22"/>
+        </w:rPr>
+        <w:t xml:space="preserve"> disponibles.</w:t>
       </w:r>
     </w:p>
     <w:tbl>
@@ -2283,8 +2600,18 @@
                 <w:color w:val="FFFFFF"/>
               </w:rPr>
               <w:lastRenderedPageBreak/>
-              <w:t>Duración del boost</w:t>
+              <w:t xml:space="preserve">Duración del </w:t>
             </w:r>
+            <w:proofErr w:type="spellStart"/>
+            <w:r>
+              <w:rPr>
+                <w:b/>
+                <w:bCs/>
+                <w:color w:val="FFFFFF"/>
+              </w:rPr>
+              <w:t>boost</w:t>
+            </w:r>
+            <w:proofErr w:type="spellEnd"/>
           </w:p>
         </w:tc>
         <w:tc>
@@ -2576,7 +2903,43 @@
           <w:iCs/>
           <w:color w:val="595959"/>
         </w:rPr>
-        <w:t>Si te quedas sin boosts disponibles, el panel principal te muestra directamente el acceso para comprar un nuevo pack. Todos los precios de boosts incluyen IVA.</w:t>
+        <w:t xml:space="preserve">Si te quedas sin </w:t>
+      </w:r>
+      <w:proofErr w:type="spellStart"/>
+      <w:r>
+        <w:rPr>
+          <w:i/>
+          <w:iCs/>
+          <w:color w:val="595959"/>
+        </w:rPr>
+        <w:t>boosts</w:t>
+      </w:r>
+      <w:proofErr w:type="spellEnd"/>
+      <w:r>
+        <w:rPr>
+          <w:i/>
+          <w:iCs/>
+          <w:color w:val="595959"/>
+        </w:rPr>
+        <w:t xml:space="preserve"> disponibles, el panel principal te muestra directamente el acceso para comprar un nuevo pack. Todos los precios de </w:t>
+      </w:r>
+      <w:proofErr w:type="spellStart"/>
+      <w:r>
+        <w:rPr>
+          <w:i/>
+          <w:iCs/>
+          <w:color w:val="595959"/>
+        </w:rPr>
+        <w:t>boosts</w:t>
+      </w:r>
+      <w:proofErr w:type="spellEnd"/>
+      <w:r>
+        <w:rPr>
+          <w:i/>
+          <w:iCs/>
+          <w:color w:val="595959"/>
+        </w:rPr>
+        <w:t xml:space="preserve"> incluyen IVA.</w:t>
       </w:r>
     </w:p>
     <w:p>
@@ -2943,11 +3306,19 @@
             </w:tcMar>
           </w:tcPr>
           <w:p>
+            <w:proofErr w:type="spellStart"/>
             <w:r>
               <w:rPr>
                 <w:color w:val="222222"/>
               </w:rPr>
-              <w:t>Push semanal</w:t>
+              <w:t>Push</w:t>
+            </w:r>
+            <w:proofErr w:type="spellEnd"/>
+            <w:r>
+              <w:rPr>
+                <w:color w:val="222222"/>
+              </w:rPr>
+              <w:t xml:space="preserve"> semanal</w:t>
             </w:r>
           </w:p>
         </w:tc>
@@ -3045,11 +3416,19 @@
             </w:tcMar>
           </w:tcPr>
           <w:p>
+            <w:proofErr w:type="spellStart"/>
             <w:r>
               <w:rPr>
                 <w:color w:val="222222"/>
               </w:rPr>
-              <w:t>Push semanal</w:t>
+              <w:t>Push</w:t>
+            </w:r>
+            <w:proofErr w:type="spellEnd"/>
+            <w:r>
+              <w:rPr>
+                <w:color w:val="222222"/>
+              </w:rPr>
+              <w:t xml:space="preserve"> semanal</w:t>
             </w:r>
           </w:p>
         </w:tc>
@@ -3126,7 +3505,43 @@
           <w:sz w:val="22"/>
           <w:szCs w:val="22"/>
         </w:rPr>
-        <w:t>Comprar packs de boosts — acceso directo a la compra de boosts de 4h o 24h</w:t>
+        <w:t xml:space="preserve">Comprar packs de </w:t>
+      </w:r>
+      <w:proofErr w:type="spellStart"/>
+      <w:r>
+        <w:rPr>
+          <w:color w:val="222222"/>
+          <w:sz w:val="22"/>
+          <w:szCs w:val="22"/>
+        </w:rPr>
+        <w:t>boosts</w:t>
+      </w:r>
+      <w:proofErr w:type="spellEnd"/>
+      <w:r>
+        <w:rPr>
+          <w:color w:val="222222"/>
+          <w:sz w:val="22"/>
+          <w:szCs w:val="22"/>
+        </w:rPr>
+        <w:t xml:space="preserve"> — acceso directo a la compra de </w:t>
+      </w:r>
+      <w:proofErr w:type="spellStart"/>
+      <w:r>
+        <w:rPr>
+          <w:color w:val="222222"/>
+          <w:sz w:val="22"/>
+          <w:szCs w:val="22"/>
+        </w:rPr>
+        <w:t>boosts</w:t>
+      </w:r>
+      <w:proofErr w:type="spellEnd"/>
+      <w:r>
+        <w:rPr>
+          <w:color w:val="222222"/>
+          <w:sz w:val="22"/>
+          <w:szCs w:val="22"/>
+        </w:rPr>
+        <w:t xml:space="preserve"> de 4h o 24h</w:t>
       </w:r>
       <w:r>
         <w:rPr>
@@ -3257,6 +3672,7 @@
           <w:sz w:val="22"/>
           <w:szCs w:val="22"/>
         </w:rPr>
+        <w:lastRenderedPageBreak/>
         <w:t>Publicaciones ilimitadas, frente al límite del plan gratuito.</w:t>
       </w:r>
     </w:p>
@@ -3275,7 +3691,6 @@
           <w:sz w:val="22"/>
           <w:szCs w:val="22"/>
         </w:rPr>
-        <w:lastRenderedPageBreak/>
         <w:t>Estadísticas completas de vistas, clics y CTR en cada publicación.</w:t>
       </w:r>
     </w:p>
@@ -3294,7 +3709,25 @@
           <w:sz w:val="22"/>
           <w:szCs w:val="22"/>
         </w:rPr>
-        <w:t>Resumen semanal por notificación push con el rendimiento de tus publicaciones activas.</w:t>
+        <w:t xml:space="preserve">Resumen semanal por notificación </w:t>
+      </w:r>
+      <w:proofErr w:type="spellStart"/>
+      <w:r>
+        <w:rPr>
+          <w:color w:val="222222"/>
+          <w:sz w:val="22"/>
+          <w:szCs w:val="22"/>
+        </w:rPr>
+        <w:t>push</w:t>
+      </w:r>
+      <w:proofErr w:type="spellEnd"/>
+      <w:r>
+        <w:rPr>
+          <w:color w:val="222222"/>
+          <w:sz w:val="22"/>
+          <w:szCs w:val="22"/>
+        </w:rPr>
+        <w:t xml:space="preserve"> con el rendimiento de tus publicaciones activas.</w:t>
       </w:r>
     </w:p>
     <w:p>
@@ -3709,7 +4142,25 @@
           <w:sz w:val="22"/>
           <w:szCs w:val="22"/>
         </w:rPr>
-        <w:t>Desde la app: entra en la pestaña 'Comerc.', baja hasta 'Sugerencias o incidencias' y se abrirá tu app de correo con los datos ya preparados.</w:t>
+        <w:t>Desde la app: entra en la pestaña '</w:t>
+      </w:r>
+      <w:proofErr w:type="spellStart"/>
+      <w:r>
+        <w:rPr>
+          <w:color w:val="222222"/>
+          <w:sz w:val="22"/>
+          <w:szCs w:val="22"/>
+        </w:rPr>
+        <w:t>Comerc</w:t>
+      </w:r>
+      <w:proofErr w:type="spellEnd"/>
+      <w:r>
+        <w:rPr>
+          <w:color w:val="222222"/>
+          <w:sz w:val="22"/>
+          <w:szCs w:val="22"/>
+        </w:rPr>
+        <w:t>.', baja hasta 'Sugerencias o incidencias' y se abrirá tu app de correo con los datos ya preparados.</w:t>
       </w:r>
     </w:p>
     <w:p>
@@ -3727,7 +4178,25 @@
           <w:sz w:val="22"/>
           <w:szCs w:val="22"/>
         </w:rPr>
-        <w:t>Directamente por email a hola@vitryna.app.</w:t>
+        <w:t xml:space="preserve">Directamente por email a </w:t>
+      </w:r>
+      <w:proofErr w:type="spellStart"/>
+      <w:r>
+        <w:rPr>
+          <w:color w:val="222222"/>
+          <w:sz w:val="22"/>
+          <w:szCs w:val="22"/>
+        </w:rPr>
+        <w:t>hola@vitryna.app</w:t>
+      </w:r>
+      <w:proofErr w:type="spellEnd"/>
+      <w:r>
+        <w:rPr>
+          <w:color w:val="222222"/>
+          <w:sz w:val="22"/>
+          <w:szCs w:val="22"/>
+        </w:rPr>
+        <w:t>.</w:t>
       </w:r>
     </w:p>
     <w:sectPr>
@@ -4820,6 +5289,7 @@
   <w:style w:type="character" w:default="1" w:styleId="Fuentedeprrafopredeter">
     <w:name w:val="Default Paragraph Font"/>
     <w:uiPriority w:val="1"/>
+    <w:semiHidden/>
     <w:unhideWhenUsed/>
   </w:style>
   <w:style w:type="table" w:default="1" w:styleId="Tablanormal">

</xml_diff>

<commit_message>
fix: restructurar las 2 primeras FAQ del manual (pregunta/respuesta en parrafos separados, sin negrita heredada) y anadir IVA incl. tambien en la cabecera de la tabla de boosts
</commit_message>
<xml_diff>
--- a/marketing/Vitryna_manual_Comercios.docx
+++ b/marketing/Vitryna_manual_Comercios.docx
@@ -2612,6 +2612,16 @@
               <w:t>boost</w:t>
             </w:r>
             <w:proofErr w:type="spellEnd"/>
+            <w:r>
+              <w:rPr>
+                <w:b/>
+                <w:bCs/>
+                <w:color w:val="FFFFFF"/>
+                <w:sz w:val="18"/>
+                <w:szCs w:val="18"/>
+              </w:rPr>
+              <w:t xml:space="preserve"> (IVA incl.)</w:t>
+            </w:r>
           </w:p>
         </w:tc>
         <w:tc>
@@ -3884,12 +3894,6 @@
       <w:pPr>
         <w:pStyle w:val="Ttulo2"/>
         <w:spacing w:before="260" w:after="120"/>
-        <w:rPr>
-          <w:b w:val="0"/>
-          <w:color w:val="222222"/>
-          <w:sz w:val="22"/>
-          <w:szCs w:val="22"/>
-        </w:rPr>
       </w:pPr>
       <w:r>
         <w:rPr>
@@ -3899,99 +3903,40 @@
         </w:rPr>
         <w:t>¿Se renuevan automáticamente los planes de pago?</w:t>
       </w:r>
+    </w:p>
+    <w:p>
+      <w:pPr>
+        <w:spacing w:after="140" w:line="300" w:lineRule="auto"/>
+      </w:pPr>
+      <w:r>
+        <w:rPr>
+          <w:color w:val="222222"/>
+          <w:sz w:val="22"/>
+          <w:szCs w:val="22"/>
+        </w:rPr>
+        <w:t>Sí. Pro y Multi-Barrio se renuevan de forma automática al final de cada periodo, sin que tengas que hacer nada. Si quieres dejar de renovarlo, debes cancelarlo tú mismo desde la pestaña "Plan", pulsando el botón "Cancelar plan". Esta acción se puede revertir pulsando el botón "Reactivar plan".</w:t>
+      </w:r>
+    </w:p>
+    <w:p>
+      <w:pPr>
+        <w:pStyle w:val="Ttulo2"/>
+        <w:spacing w:before="260" w:after="120"/>
+      </w:pPr>
       <w:r>
         <w:rPr>
           <w:color w:val="1A6BFF"/>
           <w:sz w:val="24"/>
           <w:szCs w:val="24"/>
         </w:rPr>
-        <w:br/>
-      </w:r>
-      <w:r>
-        <w:rPr>
-          <w:b w:val="0"/>
-          <w:color w:val="222222"/>
-          <w:sz w:val="22"/>
-          <w:szCs w:val="22"/>
-        </w:rPr>
-        <w:t>Sí. Pro y Multi-Barrio se renuevan de forma automática al final de cada periodo, sin que tengas que hacer nada. Si quieres dejar de renovarlo, debes cancelarlo tú mismo desde la pestaña "Plan", pulsando el botón "Cancelar plan".</w:t>
-      </w:r>
-      <w:r>
-        <w:rPr>
-          <w:b w:val="0"/>
-          <w:color w:val="222222"/>
-          <w:sz w:val="22"/>
-          <w:szCs w:val="22"/>
-        </w:rPr>
-        <w:t xml:space="preserve"> Esta acción se puede revertir pulsando el </w:t>
-      </w:r>
-      <w:r>
-        <w:rPr>
-          <w:b w:val="0"/>
-          <w:color w:val="222222"/>
-          <w:sz w:val="22"/>
-          <w:szCs w:val="22"/>
-        </w:rPr>
-        <w:t xml:space="preserve">botón </w:t>
-      </w:r>
-      <w:r>
-        <w:rPr>
-          <w:b w:val="0"/>
-          <w:color w:val="222222"/>
-          <w:sz w:val="22"/>
-          <w:szCs w:val="22"/>
-        </w:rPr>
-        <w:t>"</w:t>
-      </w:r>
-      <w:r>
-        <w:rPr>
-          <w:b w:val="0"/>
-          <w:color w:val="222222"/>
-          <w:sz w:val="22"/>
-          <w:szCs w:val="22"/>
-        </w:rPr>
-        <w:t>Reactivar</w:t>
-      </w:r>
-      <w:r>
-        <w:rPr>
-          <w:b w:val="0"/>
-          <w:color w:val="222222"/>
-          <w:sz w:val="22"/>
-          <w:szCs w:val="22"/>
-        </w:rPr>
-        <w:t xml:space="preserve"> plan".</w:t>
-      </w:r>
-    </w:p>
-    <w:p>
-      <w:pPr>
-        <w:pStyle w:val="Ttulo2"/>
-        <w:spacing w:before="260" w:after="120"/>
-        <w:rPr>
-          <w:b w:val="0"/>
-          <w:color w:val="222222"/>
-          <w:sz w:val="22"/>
-          <w:szCs w:val="22"/>
-        </w:rPr>
-      </w:pPr>
-      <w:r>
-        <w:rPr>
-          <w:color w:val="1A6BFF"/>
-          <w:sz w:val="24"/>
-          <w:szCs w:val="24"/>
-        </w:rPr>
         <w:t>¿Qué pasa si cancelo mi plan de pago?</w:t>
       </w:r>
-      <w:r>
-        <w:rPr>
-          <w:color w:val="1A6BFF"/>
-          <w:sz w:val="24"/>
-          <w:szCs w:val="24"/>
-        </w:rPr>
-        <w:br/>
-      </w:r>
-      <w:r>
-        <w:rPr>
-          <w:b w:val="0"/>
+    </w:p>
+    <w:p>
+      <w:pPr>
+        <w:spacing w:after="140" w:line="300" w:lineRule="auto"/>
+      </w:pPr>
+      <w:r>
+        <w:rPr>
           <w:color w:val="222222"/>
           <w:sz w:val="22"/>
           <w:szCs w:val="22"/>

</xml_diff>

<commit_message>
fix: quitar IVA incl. duplicado de la cabecera de la tabla de boosts (ya queda en la nota de debajo)
</commit_message>
<xml_diff>
--- a/marketing/Vitryna_manual_Comercios.docx
+++ b/marketing/Vitryna_manual_Comercios.docx
@@ -2612,16 +2612,6 @@
               <w:t>boost</w:t>
             </w:r>
             <w:proofErr w:type="spellEnd"/>
-            <w:r>
-              <w:rPr>
-                <w:b/>
-                <w:bCs/>
-                <w:color w:val="FFFFFF"/>
-                <w:sz w:val="18"/>
-                <w:szCs w:val="18"/>
-              </w:rPr>
-              <w:t xml:space="preserve"> (IVA incl.)</w:t>
-            </w:r>
           </w:p>
         </w:tc>
         <w:tc>
@@ -4038,6 +4028,7 @@
           <w:sz w:val="22"/>
           <w:szCs w:val="22"/>
         </w:rPr>
+        <w:lastRenderedPageBreak/>
         <w:t>No necesitas decidirlo tú: si tu comercio comparte CIF/NIF con otros cuatro o más comercios ya en Pro o Multi-Barrio, el sistema activa automáticamente el precio de grupo para todos ellos.</w:t>
       </w:r>
     </w:p>
@@ -4055,7 +4046,6 @@
           <w:sz w:val="30"/>
           <w:szCs w:val="30"/>
         </w:rPr>
-        <w:lastRenderedPageBreak/>
         <w:t>14. Soporte y contacto</w:t>
       </w:r>
     </w:p>

</xml_diff>

<commit_message>
feat: cabecera del manual con el bloque logo+vitryna+eslogan de marca (en vez del rectangulo azul), fuente del titulo ya resuelta correctamente al guardar desde Word
</commit_message>
<xml_diff>
--- a/marketing/Vitryna_manual_Comercios.docx
+++ b/marketing/Vitryna_manual_Comercios.docx
@@ -25,8 +25,8 @@
           <w:szCs w:val="48"/>
         </w:rPr>
         <w:drawing>
-          <wp:inline distT="0" distB="0" distL="0" distR="0" wp14:anchorId="76163CDA" wp14:editId="5B59AA37">
-            <wp:extent cx="6153150" cy="1271651"/>
+          <wp:inline distT="0" distB="0" distL="0" distR="0" wp14:anchorId="76163CDA" wp14:editId="67099A83">
+            <wp:extent cx="2468880" cy="689700"/>
             <wp:effectExtent l="0" t="0" r="0" b="5080"/>
             <wp:docPr id="18" name="Imagen 18"/>
             <wp:cNvGraphicFramePr>
@@ -40,7 +40,7 @@
                     <pic:cNvPicPr/>
                   </pic:nvPicPr>
                   <pic:blipFill>
-                    <a:blip r:embed="rId7">
+                    <a:blip r:embed="rId7" cstate="print">
                       <a:extLst>
                         <a:ext uri="{28A0092B-C50C-407E-A947-70E740481C1C}">
                           <a14:useLocalDpi xmlns:a14="http://schemas.microsoft.com/office/drawing/2010/main" val="0"/>
@@ -54,7 +54,7 @@
                   <pic:spPr>
                     <a:xfrm>
                       <a:off x="0" y="0"/>
-                      <a:ext cx="6190381" cy="1279345"/>
+                      <a:ext cx="2468880" cy="689700"/>
                     </a:xfrm>
                     <a:prstGeom prst="rect">
                       <a:avLst/>
@@ -89,23 +89,14 @@
         <w:pStyle w:val="Ttulo"/>
         <w:jc w:val="center"/>
         <w:rPr>
-          <w:sz w:val="32"/>
-          <w:szCs w:val="32"/>
-        </w:rPr>
-      </w:pPr>
-      <w:r>
-        <w:rPr>
-          <w:sz w:val="32"/>
-          <w:szCs w:val="32"/>
-        </w:rPr>
-        <w:t>M</w:t>
-      </w:r>
-      <w:r>
-        <w:rPr>
-          <w:sz w:val="32"/>
-          <w:szCs w:val="32"/>
-        </w:rPr>
-        <w:t>anual de uso para comercios</w:t>
+          <w:rFonts w:ascii="Bricolage Grotesque ExtraBold" w:hAnsi="Bricolage Grotesque ExtraBold"/>
+        </w:rPr>
+      </w:pPr>
+      <w:r>
+        <w:rPr>
+          <w:rFonts w:ascii="Bricolage Grotesque ExtraBold" w:hAnsi="Bricolage Grotesque ExtraBold"/>
+        </w:rPr>
+        <w:t>Manual de uso para comercios</w:t>
       </w:r>
     </w:p>
     <w:p>
@@ -2174,7 +2165,25 @@
           <w:sz w:val="22"/>
           <w:szCs w:val="22"/>
         </w:rPr>
-        <w:t xml:space="preserve"> cronológico de las publicaciones activas de los comercios cercanos, con un slider de radio (en metros) que ajusta la distancia de búsqueda. Es la mejor forma de comprobar cómo se ve tu propia publicación en el contexto del resto del barrio.</w:t>
+        <w:t xml:space="preserve"> cronológico de las publicaciones activas de los comercios cercanos, con </w:t>
+      </w:r>
+      <w:proofErr w:type="gramStart"/>
+      <w:r>
+        <w:rPr>
+          <w:color w:val="222222"/>
+          <w:sz w:val="22"/>
+          <w:szCs w:val="22"/>
+        </w:rPr>
+        <w:t>un slider</w:t>
+      </w:r>
+      <w:proofErr w:type="gramEnd"/>
+      <w:r>
+        <w:rPr>
+          <w:color w:val="222222"/>
+          <w:sz w:val="22"/>
+          <w:szCs w:val="22"/>
+        </w:rPr>
+        <w:t xml:space="preserve"> de radio (en metros) que ajusta la distancia de búsqueda. Es la mejor forma de comprobar cómo se ve tu propia publicación en el contexto del resto del barrio.</w:t>
       </w:r>
     </w:p>
     <w:p>
@@ -5253,7 +5262,7 @@
     <w:uiPriority w:val="10"/>
     <w:qFormat/>
     <w:rPr>
-      <w:rFonts w:ascii="Bricolage Grotesque" w:eastAsia="Bricolage Grotesque" w:hAnsi="Bricolage Grotesque" w:cs="Bricolage Grotesque"/>
+      <w:rFonts w:ascii="Bricolage Grotesque 36pt ExtraB" w:eastAsia="Bricolage Grotesque 36pt ExtraB" w:hAnsi="Bricolage Grotesque 36pt ExtraB" w:cs="Bricolage Grotesque 36pt ExtraB"/>
       <w:b/>
       <w:bCs/>
       <w:sz w:val="56"/>

</xml_diff>